<commit_message>
Pushing many changes and upgrades
</commit_message>
<xml_diff>
--- a/Computational Arts Summer Final Project Proposal.docx
+++ b/Computational Arts Summer Final Project Proposal.docx
@@ -109,6 +109,14 @@
           <w:lang w:val="en-US"/>
         </w:rPr>
         <w:t>Student ID:</w:t>
+      </w:r>
+      <w:r>
+        <w:rPr>
+          <w:rFonts w:ascii="Aptos" w:eastAsia="Aptos" w:hAnsi="Aptos" w:cs="Aptos"/>
+          <w:color w:val="000000" w:themeColor="text1"/>
+          <w:lang w:val="en-US"/>
+        </w:rPr>
+        <w:t xml:space="preserve">  33193056</w:t>
       </w:r>
     </w:p>
     <w:p>
@@ -219,31 +227,51 @@
           <w:color w:val="000000" w:themeColor="text1"/>
           <w:lang w:val="en-US"/>
         </w:rPr>
-        <w:t xml:space="preserve">A sonic exploration into my past. To track if my nostalgia for my past could help me process with where I am today. </w:t>
-      </w:r>
-      <w:r>
-        <w:rPr>
-          <w:rFonts w:ascii="Aptos" w:eastAsia="Aptos" w:hAnsi="Aptos" w:cs="Aptos"/>
-          <w:color w:val="000000" w:themeColor="text1"/>
-          <w:lang w:val="en-US"/>
-        </w:rPr>
-        <w:t>Alongside</w:t>
-      </w:r>
-      <w:r>
-        <w:rPr>
-          <w:rFonts w:ascii="Aptos" w:eastAsia="Aptos" w:hAnsi="Aptos" w:cs="Aptos"/>
-          <w:color w:val="000000" w:themeColor="text1"/>
-          <w:lang w:val="en-US"/>
-        </w:rPr>
-        <w:t xml:space="preserve"> this I am wanting to build my own </w:t>
-      </w:r>
-      <w:r>
-        <w:rPr>
-          <w:rFonts w:ascii="Aptos" w:eastAsia="Aptos" w:hAnsi="Aptos" w:cs="Aptos"/>
-          <w:color w:val="000000" w:themeColor="text1"/>
-          <w:lang w:val="en-US"/>
-        </w:rPr>
-        <w:t xml:space="preserve">software based granular synthesizer to play and re-imagine the </w:t>
+        <w:t xml:space="preserve">A </w:t>
+      </w:r>
+      <w:bookmarkStart w:id="0" w:name="_Hlk231198647"/>
+      <w:proofErr w:type="spellStart"/>
+      <w:r>
+        <w:rPr>
+          <w:rFonts w:ascii="Aptos" w:eastAsia="Aptos" w:hAnsi="Aptos" w:cs="Aptos"/>
+          <w:color w:val="000000" w:themeColor="text1"/>
+          <w:lang w:val="en-US"/>
+        </w:rPr>
+        <w:t>psychogeographic</w:t>
+      </w:r>
+      <w:proofErr w:type="spellEnd"/>
+      <w:r>
+        <w:rPr>
+          <w:rFonts w:ascii="Aptos" w:eastAsia="Aptos" w:hAnsi="Aptos" w:cs="Aptos"/>
+          <w:color w:val="000000" w:themeColor="text1"/>
+          <w:lang w:val="en-US"/>
+        </w:rPr>
+        <w:t xml:space="preserve"> </w:t>
+      </w:r>
+      <w:bookmarkEnd w:id="0"/>
+      <w:r>
+        <w:rPr>
+          <w:rFonts w:ascii="Aptos" w:eastAsia="Aptos" w:hAnsi="Aptos" w:cs="Aptos"/>
+          <w:color w:val="000000" w:themeColor="text1"/>
+          <w:lang w:val="en-US"/>
+        </w:rPr>
+        <w:t>sonic exploration into my past</w:t>
+      </w:r>
+      <w:r>
+        <w:rPr>
+          <w:rFonts w:ascii="Aptos" w:eastAsia="Aptos" w:hAnsi="Aptos" w:cs="Aptos"/>
+          <w:color w:val="000000" w:themeColor="text1"/>
+          <w:lang w:val="en-US"/>
+        </w:rPr>
+        <w:t>, t</w:t>
+      </w:r>
+      <w:r>
+        <w:rPr>
+          <w:rFonts w:ascii="Aptos" w:eastAsia="Aptos" w:hAnsi="Aptos" w:cs="Aptos"/>
+          <w:color w:val="000000" w:themeColor="text1"/>
+          <w:lang w:val="en-US"/>
+        </w:rPr>
+        <w:t xml:space="preserve">o track if my nostalgia for my past could help me process where I am today. </w:t>
       </w:r>
     </w:p>
     <w:p>
@@ -316,23 +344,23 @@
           <w:color w:val="000000" w:themeColor="text1"/>
           <w:lang w:val="en-US"/>
         </w:rPr>
-        <w:t xml:space="preserve">Whilst coming to terms with recently diagnosed long term learning disabilities </w:t>
-      </w:r>
-      <w:r>
-        <w:rPr>
-          <w:rFonts w:ascii="Aptos" w:eastAsia="Aptos" w:hAnsi="Aptos" w:cs="Aptos"/>
-          <w:color w:val="000000" w:themeColor="text1"/>
-          <w:lang w:val="en-US"/>
-        </w:rPr>
-        <w:t>as well as</w:t>
-      </w:r>
-      <w:r>
-        <w:rPr>
-          <w:rFonts w:ascii="Aptos" w:eastAsia="Aptos" w:hAnsi="Aptos" w:cs="Aptos"/>
-          <w:color w:val="000000" w:themeColor="text1"/>
-          <w:lang w:val="en-US"/>
-        </w:rPr>
-        <w:t xml:space="preserve"> at the same time a recovering, long suffering alcoholic and drug user</w:t>
+        <w:t xml:space="preserve">Whilst coming to terms with recently diagnosed </w:t>
+      </w:r>
+      <w:r>
+        <w:rPr>
+          <w:rFonts w:ascii="Aptos" w:eastAsia="Aptos" w:hAnsi="Aptos" w:cs="Aptos"/>
+          <w:color w:val="000000" w:themeColor="text1"/>
+          <w:lang w:val="en-US"/>
+        </w:rPr>
+        <w:t>long-term learning disabilities, as well as being a recovering, long-suffering</w:t>
+      </w:r>
+      <w:r>
+        <w:rPr>
+          <w:rFonts w:ascii="Aptos" w:eastAsia="Aptos" w:hAnsi="Aptos" w:cs="Aptos"/>
+          <w:color w:val="000000" w:themeColor="text1"/>
+          <w:lang w:val="en-US"/>
+        </w:rPr>
+        <w:t xml:space="preserve"> alcoholic and drug user</w:t>
       </w:r>
       <w:r>
         <w:rPr>
@@ -364,7 +392,39 @@
           <w:color w:val="000000" w:themeColor="text1"/>
           <w:lang w:val="en-US"/>
         </w:rPr>
-        <w:t xml:space="preserve">In the words of step four of the twelve steps of Alcoholics Anonymous, “Made a fearless and morel inventory of ourselves”. Can I make a fearless and searching sonic inventory of the ??????? times and events of my past which undoubtedly </w:t>
+        <w:t>In the words of step four of the twelve steps of Alcoholics Anonymous, “Made a fearless and mor</w:t>
+      </w:r>
+      <w:r>
+        <w:rPr>
+          <w:rFonts w:ascii="Aptos" w:eastAsia="Aptos" w:hAnsi="Aptos" w:cs="Aptos"/>
+          <w:color w:val="000000" w:themeColor="text1"/>
+          <w:lang w:val="en-US"/>
+        </w:rPr>
+        <w:t>a</w:t>
+      </w:r>
+      <w:r>
+        <w:rPr>
+          <w:rFonts w:ascii="Aptos" w:eastAsia="Aptos" w:hAnsi="Aptos" w:cs="Aptos"/>
+          <w:color w:val="000000" w:themeColor="text1"/>
+          <w:lang w:val="en-US"/>
+        </w:rPr>
+        <w:t>l inventory of ourselves”. Can I make a fearless and searching sonic inventory of the times and events of my past</w:t>
+      </w:r>
+      <w:r>
+        <w:rPr>
+          <w:rFonts w:ascii="Aptos" w:eastAsia="Aptos" w:hAnsi="Aptos" w:cs="Aptos"/>
+          <w:color w:val="000000" w:themeColor="text1"/>
+          <w:lang w:val="en-US"/>
+        </w:rPr>
+        <w:t>,</w:t>
+      </w:r>
+      <w:r>
+        <w:rPr>
+          <w:rFonts w:ascii="Aptos" w:eastAsia="Aptos" w:hAnsi="Aptos" w:cs="Aptos"/>
+          <w:color w:val="000000" w:themeColor="text1"/>
+          <w:lang w:val="en-US"/>
+        </w:rPr>
+        <w:t xml:space="preserve"> which undoubtedly </w:t>
       </w:r>
       <w:r>
         <w:rPr>
@@ -380,31 +440,147 @@
           <w:color w:val="000000" w:themeColor="text1"/>
           <w:lang w:val="en-US"/>
         </w:rPr>
-        <w:t xml:space="preserve"> by</w:t>
-      </w:r>
-      <w:r>
-        <w:rPr>
-          <w:rFonts w:ascii="Aptos" w:eastAsia="Aptos" w:hAnsi="Aptos" w:cs="Aptos"/>
-          <w:color w:val="000000" w:themeColor="text1"/>
-          <w:lang w:val="en-US"/>
-        </w:rPr>
-        <w:t xml:space="preserve"> revisiting the places that I have left in my past </w:t>
-      </w:r>
-      <w:r>
-        <w:rPr>
-          <w:rFonts w:ascii="Aptos" w:eastAsia="Aptos" w:hAnsi="Aptos" w:cs="Aptos"/>
-          <w:color w:val="000000" w:themeColor="text1"/>
-          <w:lang w:val="en-US"/>
-        </w:rPr>
-        <w:t xml:space="preserve">and document them using filed recording techniques to </w:t>
-      </w:r>
-      <w:r>
-        <w:rPr>
-          <w:rFonts w:ascii="Aptos" w:eastAsia="Aptos" w:hAnsi="Aptos" w:cs="Aptos"/>
-          <w:color w:val="000000" w:themeColor="text1"/>
-          <w:lang w:val="en-US"/>
-        </w:rPr>
-        <w:t xml:space="preserve">help me come to terms with who I am and shake free the nostalgic hold </w:t>
+        <w:t>? B</w:t>
+      </w:r>
+      <w:r>
+        <w:rPr>
+          <w:rFonts w:ascii="Aptos" w:eastAsia="Aptos" w:hAnsi="Aptos" w:cs="Aptos"/>
+          <w:color w:val="000000" w:themeColor="text1"/>
+          <w:lang w:val="en-US"/>
+        </w:rPr>
+        <w:t>y</w:t>
+      </w:r>
+      <w:r>
+        <w:rPr>
+          <w:rFonts w:ascii="Aptos" w:eastAsia="Aptos" w:hAnsi="Aptos" w:cs="Aptos"/>
+          <w:color w:val="000000" w:themeColor="text1"/>
+          <w:lang w:val="en-US"/>
+        </w:rPr>
+        <w:t xml:space="preserve"> revisiting the </w:t>
+      </w:r>
+      <w:proofErr w:type="gramStart"/>
+      <w:r>
+        <w:rPr>
+          <w:rFonts w:ascii="Aptos" w:eastAsia="Aptos" w:hAnsi="Aptos" w:cs="Aptos"/>
+          <w:color w:val="000000" w:themeColor="text1"/>
+          <w:lang w:val="en-US"/>
+        </w:rPr>
+        <w:t>places</w:t>
+      </w:r>
+      <w:proofErr w:type="gramEnd"/>
+      <w:r>
+        <w:rPr>
+          <w:rFonts w:ascii="Aptos" w:eastAsia="Aptos" w:hAnsi="Aptos" w:cs="Aptos"/>
+          <w:color w:val="000000" w:themeColor="text1"/>
+          <w:lang w:val="en-US"/>
+        </w:rPr>
+        <w:t xml:space="preserve"> </w:t>
+      </w:r>
+      <w:r>
+        <w:rPr>
+          <w:rFonts w:ascii="Aptos" w:eastAsia="Aptos" w:hAnsi="Aptos" w:cs="Aptos"/>
+          <w:color w:val="000000" w:themeColor="text1"/>
+          <w:lang w:val="en-US"/>
+        </w:rPr>
+        <w:t xml:space="preserve">I left behind and documenting them </w:t>
+      </w:r>
+      <w:r>
+        <w:rPr>
+          <w:rFonts w:ascii="Aptos" w:eastAsia="Aptos" w:hAnsi="Aptos" w:cs="Aptos"/>
+          <w:color w:val="000000" w:themeColor="text1"/>
+          <w:lang w:val="en-US"/>
+        </w:rPr>
+        <w:t>with</w:t>
+      </w:r>
+      <w:r>
+        <w:rPr>
+          <w:rFonts w:ascii="Aptos" w:eastAsia="Aptos" w:hAnsi="Aptos" w:cs="Aptos"/>
+          <w:color w:val="000000" w:themeColor="text1"/>
+          <w:lang w:val="en-US"/>
+        </w:rPr>
+        <w:t xml:space="preserve"> field recording techniques</w:t>
+      </w:r>
+      <w:r>
+        <w:rPr>
+          <w:rFonts w:ascii="Aptos" w:eastAsia="Aptos" w:hAnsi="Aptos" w:cs="Aptos"/>
+          <w:color w:val="000000" w:themeColor="text1"/>
+          <w:lang w:val="en-US"/>
+        </w:rPr>
+        <w:t>, I want this process</w:t>
+      </w:r>
+      <w:r>
+        <w:rPr>
+          <w:rFonts w:ascii="Aptos" w:eastAsia="Aptos" w:hAnsi="Aptos" w:cs="Aptos"/>
+          <w:color w:val="000000" w:themeColor="text1"/>
+          <w:lang w:val="en-US"/>
+        </w:rPr>
+        <w:t xml:space="preserve"> to help me come to terms with who I am</w:t>
+      </w:r>
+      <w:r>
+        <w:rPr>
+          <w:rFonts w:ascii="Aptos" w:eastAsia="Aptos" w:hAnsi="Aptos" w:cs="Aptos"/>
+          <w:color w:val="000000" w:themeColor="text1"/>
+          <w:lang w:val="en-US"/>
+        </w:rPr>
+        <w:t>,</w:t>
+      </w:r>
+      <w:r>
+        <w:rPr>
+          <w:rFonts w:ascii="Aptos" w:eastAsia="Aptos" w:hAnsi="Aptos" w:cs="Aptos"/>
+          <w:color w:val="000000" w:themeColor="text1"/>
+          <w:lang w:val="en-US"/>
+        </w:rPr>
+        <w:t xml:space="preserve"> shake free the nostalgic hold they have on me, and</w:t>
+      </w:r>
+      <w:r>
+        <w:rPr>
+          <w:rFonts w:ascii="Aptos" w:eastAsia="Aptos" w:hAnsi="Aptos" w:cs="Aptos"/>
+          <w:color w:val="000000" w:themeColor="text1"/>
+          <w:lang w:val="en-US"/>
+        </w:rPr>
+        <w:t xml:space="preserve"> </w:t>
+      </w:r>
+      <w:r>
+        <w:rPr>
+          <w:rFonts w:ascii="Aptos" w:eastAsia="Aptos" w:hAnsi="Aptos" w:cs="Aptos"/>
+          <w:color w:val="000000" w:themeColor="text1"/>
+          <w:lang w:val="en-US"/>
+        </w:rPr>
+        <w:t xml:space="preserve">understand </w:t>
+      </w:r>
+      <w:r>
+        <w:rPr>
+          <w:rFonts w:ascii="Aptos" w:eastAsia="Aptos" w:hAnsi="Aptos" w:cs="Aptos"/>
+          <w:color w:val="000000" w:themeColor="text1"/>
+          <w:lang w:val="en-US"/>
+        </w:rPr>
+        <w:t>how I behave today.</w:t>
+      </w:r>
+      <w:r>
+        <w:rPr>
+          <w:rFonts w:ascii="Aptos" w:eastAsia="Aptos" w:hAnsi="Aptos" w:cs="Aptos"/>
+          <w:color w:val="000000" w:themeColor="text1"/>
+          <w:lang w:val="en-US"/>
+        </w:rPr>
+        <w:t xml:space="preserve"> According to Svetlana </w:t>
+      </w:r>
+      <w:proofErr w:type="spellStart"/>
+      <w:r>
+        <w:rPr>
+          <w:rFonts w:ascii="Aptos" w:eastAsia="Aptos" w:hAnsi="Aptos" w:cs="Aptos"/>
+          <w:color w:val="000000" w:themeColor="text1"/>
+          <w:lang w:val="en-US"/>
+        </w:rPr>
+        <w:t>Boym</w:t>
+      </w:r>
+      <w:proofErr w:type="spellEnd"/>
+      <w:r>
+        <w:rPr>
+          <w:rFonts w:ascii="Aptos" w:eastAsia="Aptos" w:hAnsi="Aptos" w:cs="Aptos"/>
+          <w:color w:val="000000" w:themeColor="text1"/>
+          <w:lang w:val="en-US"/>
+        </w:rPr>
+        <w:t xml:space="preserve"> “Swiss Doctors believed </w:t>
       </w:r>
       <w:r>
         <w:rPr>
@@ -413,33 +589,7 @@
           <w:lang w:val="en-US"/>
         </w:rPr>
         <w:lastRenderedPageBreak/>
-        <w:t>this has on me along with how I behave today.</w:t>
-      </w:r>
-      <w:r>
-        <w:rPr>
-          <w:rFonts w:ascii="Aptos" w:eastAsia="Aptos" w:hAnsi="Aptos" w:cs="Aptos"/>
-          <w:color w:val="000000" w:themeColor="text1"/>
-          <w:lang w:val="en-US"/>
-        </w:rPr>
-        <w:t xml:space="preserve"> According to Svetlana </w:t>
-      </w:r>
-      <w:proofErr w:type="spellStart"/>
-      <w:r>
-        <w:rPr>
-          <w:rFonts w:ascii="Aptos" w:eastAsia="Aptos" w:hAnsi="Aptos" w:cs="Aptos"/>
-          <w:color w:val="000000" w:themeColor="text1"/>
-          <w:lang w:val="en-US"/>
-        </w:rPr>
-        <w:t>Boym</w:t>
-      </w:r>
-      <w:proofErr w:type="spellEnd"/>
-      <w:r>
-        <w:rPr>
-          <w:rFonts w:ascii="Aptos" w:eastAsia="Aptos" w:hAnsi="Aptos" w:cs="Aptos"/>
-          <w:color w:val="000000" w:themeColor="text1"/>
-          <w:lang w:val="en-US"/>
-        </w:rPr>
-        <w:t xml:space="preserve"> “Swiss Doctors believed that opium, leeches and a journey to the Swiss Alps would take care of nostalgic symptoms”</w:t>
+        <w:t>that opium, leeches and a journey to the Swiss Alps would take care of nostalgic symptoms”</w:t>
       </w:r>
       <w:r>
         <w:rPr>
@@ -488,7 +638,23 @@
           <w:color w:val="000000" w:themeColor="text1"/>
           <w:lang w:val="en-US"/>
         </w:rPr>
-        <w:t>. Being an addict step 1 is out of the question. Bloodletting isn’t really my thing (unless it’s an accidental/</w:t>
+        <w:t>. Being an addict</w:t>
+      </w:r>
+      <w:r>
+        <w:rPr>
+          <w:rFonts w:ascii="Aptos" w:eastAsia="Aptos" w:hAnsi="Aptos" w:cs="Aptos"/>
+          <w:color w:val="000000" w:themeColor="text1"/>
+          <w:lang w:val="en-US"/>
+        </w:rPr>
+        <w:t>,</w:t>
+      </w:r>
+      <w:r>
+        <w:rPr>
+          <w:rFonts w:ascii="Aptos" w:eastAsia="Aptos" w:hAnsi="Aptos" w:cs="Aptos"/>
+          <w:color w:val="000000" w:themeColor="text1"/>
+          <w:lang w:val="en-US"/>
+        </w:rPr>
+        <w:t xml:space="preserve"> step 1 is out of the question. Bloodletting isn’t really my thing (unless it’s an accidental/</w:t>
       </w:r>
       <w:proofErr w:type="spellStart"/>
       <w:r>
@@ -595,7 +761,39 @@
           <w:color w:val="000000" w:themeColor="text1"/>
           <w:lang w:val="en-US"/>
         </w:rPr>
-        <w:t xml:space="preserve">Currently the work is audio based, but with </w:t>
+        <w:t>Currently</w:t>
+      </w:r>
+      <w:r>
+        <w:rPr>
+          <w:rFonts w:ascii="Aptos" w:eastAsia="Aptos" w:hAnsi="Aptos" w:cs="Aptos"/>
+          <w:color w:val="000000" w:themeColor="text1"/>
+          <w:lang w:val="en-US"/>
+        </w:rPr>
+        <w:t>,</w:t>
+      </w:r>
+      <w:r>
+        <w:rPr>
+          <w:rFonts w:ascii="Aptos" w:eastAsia="Aptos" w:hAnsi="Aptos" w:cs="Aptos"/>
+          <w:color w:val="000000" w:themeColor="text1"/>
+          <w:lang w:val="en-US"/>
+        </w:rPr>
+        <w:t xml:space="preserve"> the work is audio</w:t>
+      </w:r>
+      <w:r>
+        <w:rPr>
+          <w:rFonts w:ascii="Aptos" w:eastAsia="Aptos" w:hAnsi="Aptos" w:cs="Aptos"/>
+          <w:color w:val="000000" w:themeColor="text1"/>
+          <w:lang w:val="en-US"/>
+        </w:rPr>
+        <w:t>-</w:t>
+      </w:r>
+      <w:r>
+        <w:rPr>
+          <w:rFonts w:ascii="Aptos" w:eastAsia="Aptos" w:hAnsi="Aptos" w:cs="Aptos"/>
+          <w:color w:val="000000" w:themeColor="text1"/>
+          <w:lang w:val="en-US"/>
+        </w:rPr>
+        <w:t xml:space="preserve">based, but with </w:t>
       </w:r>
       <w:r>
         <w:rPr>
@@ -607,11 +805,32 @@
       </w:r>
       <w:proofErr w:type="spellStart"/>
       <w:r>
-        <w:t>psychogeographical</w:t>
+        <w:rPr>
+          <w:rFonts w:ascii="Aptos" w:eastAsia="Aptos" w:hAnsi="Aptos" w:cs="Aptos"/>
+          <w:color w:val="000000" w:themeColor="text1"/>
+          <w:lang w:val="en-US"/>
+        </w:rPr>
+        <w:t>psychogeographic</w:t>
+      </w:r>
+      <w:r>
+        <w:rPr>
+          <w:rFonts w:ascii="Aptos" w:eastAsia="Aptos" w:hAnsi="Aptos" w:cs="Aptos"/>
+          <w:color w:val="000000" w:themeColor="text1"/>
+          <w:lang w:val="en-US"/>
+        </w:rPr>
+        <w:t>al</w:t>
       </w:r>
       <w:proofErr w:type="spellEnd"/>
       <w:r>
-        <w:t xml:space="preserve"> element. The installation may be a </w:t>
+        <w:rPr>
+          <w:rFonts w:ascii="Aptos" w:eastAsia="Aptos" w:hAnsi="Aptos" w:cs="Aptos"/>
+          <w:color w:val="000000" w:themeColor="text1"/>
+          <w:lang w:val="en-US"/>
+        </w:rPr>
+        <w:t xml:space="preserve"> </w:t>
+      </w:r>
+      <w:r>
+        <w:t xml:space="preserve">element. The installation may be a </w:t>
       </w:r>
       <w:r>
         <w:t>two-channel</w:t>
@@ -620,10 +839,34 @@
         <w:t xml:space="preserve"> audio work</w:t>
       </w:r>
       <w:r>
+        <w:t>,</w:t>
+      </w:r>
+      <w:r>
         <w:t xml:space="preserve"> possibly more</w:t>
       </w:r>
       <w:r>
-        <w:t>, with Ordinant Survey maps displayed. Possibly even photograph documentary of the places visit. Ideally a semi – dark space</w:t>
+        <w:t>, with Ordinan</w:t>
+      </w:r>
+      <w:r>
+        <w:t>ce</w:t>
+      </w:r>
+      <w:r>
+        <w:t xml:space="preserve"> Survey maps displayed. Possibly even </w:t>
+      </w:r>
+      <w:r>
+        <w:t>a photographic</w:t>
+      </w:r>
+      <w:r>
+        <w:t xml:space="preserve"> documentary of the places visit</w:t>
+      </w:r>
+      <w:r>
+        <w:t>ed</w:t>
+      </w:r>
+      <w:r>
+        <w:t>. Ideally a semi – dark space</w:t>
+      </w:r>
+      <w:r>
+        <w:t xml:space="preserve"> – spot lit, highlighting the elements of the exhibition.</w:t>
       </w:r>
     </w:p>
     <w:p>
@@ -709,7 +952,35 @@
           <w:rFonts w:ascii="Aptos" w:eastAsia="Aptos" w:hAnsi="Aptos" w:cs="Aptos"/>
           <w:color w:val="000000" w:themeColor="text1"/>
         </w:rPr>
-        <w:t>I think I would hopefully end up using hacked personal cassette players, dotted around the space along with the maps pinned to walls. If using digital images, I would possibly need screens</w:t>
+        <w:t>I think I would hopefully end up using hacked personal cassette players, dotted around the space</w:t>
+      </w:r>
+      <w:r>
+        <w:rPr>
+          <w:rFonts w:ascii="Aptos" w:eastAsia="Aptos" w:hAnsi="Aptos" w:cs="Aptos"/>
+          <w:color w:val="000000" w:themeColor="text1"/>
+        </w:rPr>
+        <w:t>,</w:t>
+      </w:r>
+      <w:r>
+        <w:rPr>
+          <w:rFonts w:ascii="Aptos" w:eastAsia="Aptos" w:hAnsi="Aptos" w:cs="Aptos"/>
+          <w:color w:val="000000" w:themeColor="text1"/>
+        </w:rPr>
+        <w:t xml:space="preserve"> along with the maps</w:t>
+      </w:r>
+      <w:r>
+        <w:rPr>
+          <w:rFonts w:ascii="Aptos" w:eastAsia="Aptos" w:hAnsi="Aptos" w:cs="Aptos"/>
+          <w:color w:val="000000" w:themeColor="text1"/>
+        </w:rPr>
+        <w:t xml:space="preserve"> hung from the ceiling, or, as a last resort,</w:t>
+      </w:r>
+      <w:r>
+        <w:rPr>
+          <w:rFonts w:ascii="Aptos" w:eastAsia="Aptos" w:hAnsi="Aptos" w:cs="Aptos"/>
+          <w:color w:val="000000" w:themeColor="text1"/>
+        </w:rPr>
+        <w:t xml:space="preserve"> pinned to walls. If using digital images, I would possibly need screens</w:t>
       </w:r>
       <w:r>
         <w:rPr>
@@ -818,11 +1089,17 @@
     <w:p>
       <w:pPr>
         <w:pStyle w:val="Heading3"/>
-      </w:pPr>
-      <w:r>
-        <w:rPr>
-          <w:rFonts w:ascii="Aptos" w:eastAsia="Aptos" w:hAnsi="Aptos" w:cs="Aptos"/>
-          <w:color w:val="000000" w:themeColor="text1"/>
+        <w:rPr>
+          <w:sz w:val="24"/>
+          <w:szCs w:val="24"/>
+        </w:rPr>
+      </w:pPr>
+      <w:r>
+        <w:rPr>
+          <w:rFonts w:ascii="Aptos" w:eastAsia="Aptos" w:hAnsi="Aptos" w:cs="Aptos"/>
+          <w:color w:val="000000" w:themeColor="text1"/>
+          <w:sz w:val="24"/>
+          <w:szCs w:val="24"/>
           <w:lang w:val="en-US"/>
         </w:rPr>
         <w:t>The start</w:t>
@@ -831,6 +1108,8 @@
         <w:rPr>
           <w:rFonts w:ascii="Aptos" w:eastAsia="Aptos" w:hAnsi="Aptos" w:cs="Aptos"/>
           <w:color w:val="000000" w:themeColor="text1"/>
+          <w:sz w:val="24"/>
+          <w:szCs w:val="24"/>
           <w:lang w:val="en-US"/>
         </w:rPr>
         <w:t>ing</w:t>
@@ -839,14 +1118,18 @@
         <w:rPr>
           <w:rFonts w:ascii="Aptos" w:eastAsia="Aptos" w:hAnsi="Aptos" w:cs="Aptos"/>
           <w:color w:val="000000" w:themeColor="text1"/>
-          <w:lang w:val="en-US"/>
-        </w:rPr>
-        <w:t xml:space="preserve"> point is Mark Fisher “Capital Realism” and “Ghosts of My Life”, Svetlana Boym, Future of Nostalgia, Chris Watson – Stepping into the Dark</w:t>
-      </w:r>
-      <w:r>
-        <w:rPr>
-          <w:rFonts w:ascii="Aptos" w:eastAsia="Aptos" w:hAnsi="Aptos" w:cs="Aptos"/>
-          <w:color w:val="000000" w:themeColor="text1"/>
+          <w:sz w:val="24"/>
+          <w:szCs w:val="24"/>
+          <w:lang w:val="en-US"/>
+        </w:rPr>
+        <w:t xml:space="preserve"> point is Mark Fisher “Capital Realism”</w:t>
+      </w:r>
+      <w:r>
+        <w:rPr>
+          <w:rFonts w:ascii="Aptos" w:eastAsia="Aptos" w:hAnsi="Aptos" w:cs="Aptos"/>
+          <w:color w:val="000000" w:themeColor="text1"/>
+          <w:sz w:val="24"/>
+          <w:szCs w:val="24"/>
           <w:lang w:val="en-US"/>
         </w:rPr>
         <w:fldChar w:fldCharType="begin"/>
@@ -855,14 +1138,18 @@
         <w:rPr>
           <w:rFonts w:ascii="Aptos" w:eastAsia="Aptos" w:hAnsi="Aptos" w:cs="Aptos"/>
           <w:color w:val="000000" w:themeColor="text1"/>
-          <w:lang w:val="en-US"/>
-        </w:rPr>
-        <w:instrText xml:space="preserve"> ADDIN ZOTERO_ITEM CSL_CITATION {"citationID":"3jFfCRRg","properties":{"formattedCitation":"[2]","plainCitation":"[2]","noteIndex":0},"citationItems":[{"id":490,"uris":["http://zotero.org/users/10576494/items/92EE5ZJ7"],"itemData":{"id":490,"type":"webpage","abstract":"12 track album","container-title":"Chris Watson","language":"en","title":"Stepping into the Dark, by Chris Watson","URL":"https://chriswatsonreleases.bandcamp.com/album/stepping-into-the-dark","accessed":{"date-parts":[["2026",5,22]]}}}],"schema":"https://github.com/citation-style-language/schema/raw/master/csl-citation.json"} </w:instrText>
-      </w:r>
-      <w:r>
-        <w:rPr>
-          <w:rFonts w:ascii="Aptos" w:eastAsia="Aptos" w:hAnsi="Aptos" w:cs="Aptos"/>
-          <w:color w:val="000000" w:themeColor="text1"/>
+          <w:sz w:val="24"/>
+          <w:szCs w:val="24"/>
+          <w:lang w:val="en-US"/>
+        </w:rPr>
+        <w:instrText xml:space="preserve"> ADDIN ZOTERO_ITEM CSL_CITATION {"citationID":"STQhnpz6","properties":{"unsorted":false,"formattedCitation":"[2]","plainCitation":"[2]","noteIndex":0},"citationItems":[{"id":203,"uris":["http://zotero.org/users/10576494/items/I34L83X6"],"itemData":{"id":203,"type":"book","abstract":"After 1989, capitalism has successfully presented itself as the only realistic political-economic system - a situation that the bank crisis of 2008, far from ending, actually compounded. This book analyses the development and principal features of this capitalist realism as a lived ideological framework. After 1989, capitalism has successfully presented itself as the only realistic political-economic system - a situation that the bank crisis of 2008, far from ending, actually compounded. The book analyses the development and principal features of this capitalist realism as a lived ideological framework. Using examples from politics, films, fiction, work and education, it argues that capitalist realism colours all areas of contemporary experience. But it will also show that, because of a number of inconsistencies and glitches internal to the capitalist reality program capitalism in fact is anything but realistic.","ISBN":"978-1-78099-734-6","language":"eng","publisher":"Zero Books","publisher-place":"Winchester, UK","title":"Capitalist realism is there no alternative?","author":[{"family":"Fisher","given":"Mark"}],"issued":{"date-parts":[["2009"]]}}}],"schema":"https://github.com/citation-style-language/schema/raw/master/csl-citation.json"} </w:instrText>
+      </w:r>
+      <w:r>
+        <w:rPr>
+          <w:rFonts w:ascii="Aptos" w:eastAsia="Aptos" w:hAnsi="Aptos" w:cs="Aptos"/>
+          <w:color w:val="000000" w:themeColor="text1"/>
+          <w:sz w:val="24"/>
+          <w:szCs w:val="24"/>
           <w:lang w:val="en-US"/>
         </w:rPr>
         <w:fldChar w:fldCharType="separate"/>
@@ -872,6 +1159,8 @@
           <w:rFonts w:ascii="Aptos" w:eastAsia="Aptos" w:hAnsi="Aptos" w:cs="Aptos"/>
           <w:noProof/>
           <w:color w:val="000000" w:themeColor="text1"/>
+          <w:sz w:val="24"/>
+          <w:szCs w:val="24"/>
           <w:lang w:val="en-US"/>
         </w:rPr>
         <w:t>[2]</w:t>
@@ -880,6 +1169,8 @@
         <w:rPr>
           <w:rFonts w:ascii="Aptos" w:eastAsia="Aptos" w:hAnsi="Aptos" w:cs="Aptos"/>
           <w:color w:val="000000" w:themeColor="text1"/>
+          <w:sz w:val="24"/>
+          <w:szCs w:val="24"/>
           <w:lang w:val="en-US"/>
         </w:rPr>
         <w:fldChar w:fldCharType="end"/>
@@ -888,12 +1179,285 @@
         <w:rPr>
           <w:rFonts w:ascii="Aptos" w:eastAsia="Aptos" w:hAnsi="Aptos" w:cs="Aptos"/>
           <w:color w:val="000000" w:themeColor="text1"/>
+          <w:sz w:val="24"/>
+          <w:szCs w:val="24"/>
+          <w:lang w:val="en-US"/>
+        </w:rPr>
+        <w:t xml:space="preserve"> and “Ghosts of My Life”</w:t>
+      </w:r>
+      <w:r>
+        <w:rPr>
+          <w:rFonts w:ascii="Aptos" w:eastAsia="Aptos" w:hAnsi="Aptos" w:cs="Aptos"/>
+          <w:color w:val="000000" w:themeColor="text1"/>
+          <w:sz w:val="24"/>
+          <w:szCs w:val="24"/>
+          <w:lang w:val="en-US"/>
+        </w:rPr>
+        <w:fldChar w:fldCharType="begin"/>
+      </w:r>
+      <w:r>
+        <w:rPr>
+          <w:rFonts w:ascii="Aptos" w:eastAsia="Aptos" w:hAnsi="Aptos" w:cs="Aptos"/>
+          <w:color w:val="000000" w:themeColor="text1"/>
+          <w:sz w:val="24"/>
+          <w:szCs w:val="24"/>
+          <w:lang w:val="en-US"/>
+        </w:rPr>
+        <w:instrText xml:space="preserve"> ADDIN ZOTERO_ITEM CSL_CITATION {"citationID":"NgQmvBsI","properties":{"unsorted":false,"formattedCitation":"[3]","plainCitation":"[3]","noteIndex":0},"citationItems":[{"id":492,"uris":["http://zotero.org/users/10576494/items/65NQJ9PV"],"itemData":{"id":492,"type":"book","abstract":"This collection of writings by Mark Fisher argues that we are haunted by futures that failed to happen. Fisher searches for the traces of these lost futures in the work of David Peace, John Le Carre, Christopher Nolan, Joy Division, Burial and many others.","edition":"New edition / with introduction by Matt Colquhoun and afterword by Simon Reynolds..","ISBN":"978-1-78099-226-6","language":"eng","publisher":"Zero Books","publisher-place":"Winchester, UK","title":"Ghosts of my life : writings on depression, hauntology and lost futures","author":[{"family":"Fisher","given":"Mark"}],"issued":{"date-parts":[["2014"]]}}}],"schema":"https://github.com/citation-style-language/schema/raw/master/csl-citation.json"} </w:instrText>
+      </w:r>
+      <w:r>
+        <w:rPr>
+          <w:rFonts w:ascii="Aptos" w:eastAsia="Aptos" w:hAnsi="Aptos" w:cs="Aptos"/>
+          <w:color w:val="000000" w:themeColor="text1"/>
+          <w:sz w:val="24"/>
+          <w:szCs w:val="24"/>
+          <w:lang w:val="en-US"/>
+        </w:rPr>
+        <w:fldChar w:fldCharType="separate"/>
+      </w:r>
+      <w:r>
+        <w:rPr>
+          <w:rFonts w:ascii="Aptos" w:eastAsia="Aptos" w:hAnsi="Aptos" w:cs="Aptos"/>
+          <w:noProof/>
+          <w:color w:val="000000" w:themeColor="text1"/>
+          <w:sz w:val="24"/>
+          <w:szCs w:val="24"/>
+          <w:lang w:val="en-US"/>
+        </w:rPr>
+        <w:t>[3]</w:t>
+      </w:r>
+      <w:r>
+        <w:rPr>
+          <w:rFonts w:ascii="Aptos" w:eastAsia="Aptos" w:hAnsi="Aptos" w:cs="Aptos"/>
+          <w:color w:val="000000" w:themeColor="text1"/>
+          <w:sz w:val="24"/>
+          <w:szCs w:val="24"/>
+          <w:lang w:val="en-US"/>
+        </w:rPr>
+        <w:fldChar w:fldCharType="end"/>
+      </w:r>
+      <w:r>
+        <w:rPr>
+          <w:rFonts w:ascii="Aptos" w:eastAsia="Aptos" w:hAnsi="Aptos" w:cs="Aptos"/>
+          <w:color w:val="000000" w:themeColor="text1"/>
+          <w:sz w:val="24"/>
+          <w:szCs w:val="24"/>
+          <w:lang w:val="en-US"/>
+        </w:rPr>
+        <w:t>, specifically the chapter 00 – Lost Futures</w:t>
+      </w:r>
+      <w:r>
+        <w:rPr>
+          <w:rFonts w:ascii="Aptos" w:eastAsia="Aptos" w:hAnsi="Aptos" w:cs="Aptos"/>
+          <w:color w:val="000000" w:themeColor="text1"/>
+          <w:sz w:val="24"/>
+          <w:szCs w:val="24"/>
+          <w:lang w:val="en-US"/>
+        </w:rPr>
+        <w:t xml:space="preserve">, Svetlana </w:t>
+      </w:r>
+      <w:proofErr w:type="spellStart"/>
+      <w:r>
+        <w:rPr>
+          <w:rFonts w:ascii="Aptos" w:eastAsia="Aptos" w:hAnsi="Aptos" w:cs="Aptos"/>
+          <w:color w:val="000000" w:themeColor="text1"/>
+          <w:sz w:val="24"/>
+          <w:szCs w:val="24"/>
+          <w:lang w:val="en-US"/>
+        </w:rPr>
+        <w:t>Boym</w:t>
+      </w:r>
+      <w:proofErr w:type="spellEnd"/>
+      <w:r>
+        <w:rPr>
+          <w:rFonts w:ascii="Aptos" w:eastAsia="Aptos" w:hAnsi="Aptos" w:cs="Aptos"/>
+          <w:color w:val="000000" w:themeColor="text1"/>
+          <w:sz w:val="24"/>
+          <w:szCs w:val="24"/>
+          <w:lang w:val="en-US"/>
+        </w:rPr>
+        <w:t xml:space="preserve"> - </w:t>
+      </w:r>
+      <w:r>
+        <w:rPr>
+          <w:rFonts w:ascii="Aptos" w:eastAsia="Aptos" w:hAnsi="Aptos" w:cs="Aptos"/>
+          <w:color w:val="000000" w:themeColor="text1"/>
+          <w:sz w:val="24"/>
+          <w:szCs w:val="24"/>
+          <w:lang w:val="en-US"/>
+        </w:rPr>
+        <w:t>Future of Nostalgia</w:t>
+      </w:r>
+      <w:r>
+        <w:rPr>
+          <w:rFonts w:ascii="Aptos" w:eastAsia="Aptos" w:hAnsi="Aptos" w:cs="Aptos"/>
+          <w:color w:val="000000" w:themeColor="text1"/>
+          <w:sz w:val="24"/>
+          <w:szCs w:val="24"/>
+          <w:lang w:val="en-US"/>
+        </w:rPr>
+        <w:fldChar w:fldCharType="begin"/>
+      </w:r>
+      <w:r>
+        <w:rPr>
+          <w:rFonts w:ascii="Aptos" w:eastAsia="Aptos" w:hAnsi="Aptos" w:cs="Aptos"/>
+          <w:color w:val="000000" w:themeColor="text1"/>
+          <w:sz w:val="24"/>
+          <w:szCs w:val="24"/>
+          <w:lang w:val="en-US"/>
+        </w:rPr>
+        <w:instrText xml:space="preserve"> ADDIN ZOTERO_ITEM CSL_CITATION {"citationID":"8Z3KAvQw","properties":{"unsorted":false,"formattedCitation":"[1]","plainCitation":"[1]","noteIndex":0},"citationItems":[{"id":487,"uris":["http://zotero.org/users/10576494/items/WM7UGF76"],"itemData":{"id":487,"type":"book","ISBN":"0-465-00708-2","language":"eng","note":"LCCN: 00045454","publisher":"Basic Books","publisher-place":"New York","title":"The future of nostalgia","author":[{"family":"Boym","given":"Svetlana"}],"issued":{"date-parts":[["2001"]]}}}],"schema":"https://github.com/citation-style-language/schema/raw/master/csl-citation.json"} </w:instrText>
+      </w:r>
+      <w:r>
+        <w:rPr>
+          <w:rFonts w:ascii="Aptos" w:eastAsia="Aptos" w:hAnsi="Aptos" w:cs="Aptos"/>
+          <w:color w:val="000000" w:themeColor="text1"/>
+          <w:sz w:val="24"/>
+          <w:szCs w:val="24"/>
+          <w:lang w:val="en-US"/>
+        </w:rPr>
+        <w:fldChar w:fldCharType="separate"/>
+      </w:r>
+      <w:r>
+        <w:rPr>
+          <w:rFonts w:ascii="Aptos" w:eastAsia="Aptos" w:hAnsi="Aptos" w:cs="Aptos"/>
+          <w:noProof/>
+          <w:color w:val="000000" w:themeColor="text1"/>
+          <w:sz w:val="24"/>
+          <w:szCs w:val="24"/>
+          <w:lang w:val="en-US"/>
+        </w:rPr>
+        <w:t>[1]</w:t>
+      </w:r>
+      <w:r>
+        <w:rPr>
+          <w:rFonts w:ascii="Aptos" w:eastAsia="Aptos" w:hAnsi="Aptos" w:cs="Aptos"/>
+          <w:color w:val="000000" w:themeColor="text1"/>
+          <w:sz w:val="24"/>
+          <w:szCs w:val="24"/>
+          <w:lang w:val="en-US"/>
+        </w:rPr>
+        <w:fldChar w:fldCharType="end"/>
+      </w:r>
+      <w:r>
+        <w:rPr>
+          <w:rFonts w:ascii="Aptos" w:eastAsia="Aptos" w:hAnsi="Aptos" w:cs="Aptos"/>
+          <w:color w:val="000000" w:themeColor="text1"/>
+          <w:sz w:val="24"/>
+          <w:szCs w:val="24"/>
+          <w:lang w:val="en-US"/>
+        </w:rPr>
+        <w:t>, Chris Watson – Stepping into the Dark</w:t>
+      </w:r>
+      <w:r>
+        <w:rPr>
+          <w:rFonts w:ascii="Aptos" w:eastAsia="Aptos" w:hAnsi="Aptos" w:cs="Aptos"/>
+          <w:color w:val="000000" w:themeColor="text1"/>
+          <w:sz w:val="24"/>
+          <w:szCs w:val="24"/>
+          <w:lang w:val="en-US"/>
+        </w:rPr>
+        <w:fldChar w:fldCharType="begin"/>
+      </w:r>
+      <w:r>
+        <w:rPr>
+          <w:rFonts w:ascii="Aptos" w:eastAsia="Aptos" w:hAnsi="Aptos" w:cs="Aptos"/>
+          <w:color w:val="000000" w:themeColor="text1"/>
+          <w:sz w:val="24"/>
+          <w:szCs w:val="24"/>
+          <w:lang w:val="en-US"/>
+        </w:rPr>
+        <w:instrText xml:space="preserve"> ADDIN ZOTERO_ITEM CSL_CITATION {"citationID":"3jFfCRRg","properties":{"formattedCitation":"[4]","plainCitation":"[4]","noteIndex":0},"citationItems":[{"id":490,"uris":["http://zotero.org/users/10576494/items/92EE5ZJ7"],"itemData":{"id":490,"type":"webpage","abstract":"12 track album","container-title":"Chris Watson","language":"en","title":"Stepping into the Dark, by Chris Watson","URL":"https://chriswatsonreleases.bandcamp.com/album/stepping-into-the-dark","accessed":{"date-parts":[["2026",5,22]]}}}],"schema":"https://github.com/citation-style-language/schema/raw/master/csl-citation.json"} </w:instrText>
+      </w:r>
+      <w:r>
+        <w:rPr>
+          <w:rFonts w:ascii="Aptos" w:eastAsia="Aptos" w:hAnsi="Aptos" w:cs="Aptos"/>
+          <w:color w:val="000000" w:themeColor="text1"/>
+          <w:sz w:val="24"/>
+          <w:szCs w:val="24"/>
+          <w:lang w:val="en-US"/>
+        </w:rPr>
+        <w:fldChar w:fldCharType="separate"/>
+      </w:r>
+      <w:r>
+        <w:rPr>
+          <w:rFonts w:ascii="Aptos" w:eastAsia="Aptos" w:hAnsi="Aptos" w:cs="Aptos"/>
+          <w:noProof/>
+          <w:color w:val="000000" w:themeColor="text1"/>
+          <w:sz w:val="24"/>
+          <w:szCs w:val="24"/>
+          <w:lang w:val="en-US"/>
+        </w:rPr>
+        <w:t>[4]</w:t>
+      </w:r>
+      <w:r>
+        <w:rPr>
+          <w:rFonts w:ascii="Aptos" w:eastAsia="Aptos" w:hAnsi="Aptos" w:cs="Aptos"/>
+          <w:color w:val="000000" w:themeColor="text1"/>
+          <w:sz w:val="24"/>
+          <w:szCs w:val="24"/>
+          <w:lang w:val="en-US"/>
+        </w:rPr>
+        <w:fldChar w:fldCharType="end"/>
+      </w:r>
+      <w:r>
+        <w:rPr>
+          <w:rFonts w:ascii="Aptos" w:eastAsia="Aptos" w:hAnsi="Aptos" w:cs="Aptos"/>
+          <w:color w:val="000000" w:themeColor="text1"/>
+          <w:sz w:val="24"/>
+          <w:szCs w:val="24"/>
           <w:lang w:val="en-US"/>
         </w:rPr>
         <w:t xml:space="preserve"> and </w:t>
       </w:r>
       <w:r>
+        <w:rPr>
+          <w:color w:val="000000" w:themeColor="text1"/>
+          <w:sz w:val="24"/>
+          <w:szCs w:val="24"/>
+        </w:rPr>
         <w:t>Jacques Derrida’s Spectres of Marx</w:t>
+      </w:r>
+      <w:r>
+        <w:rPr>
+          <w:color w:val="000000" w:themeColor="text1"/>
+          <w:sz w:val="24"/>
+          <w:szCs w:val="24"/>
+        </w:rPr>
+        <w:fldChar w:fldCharType="begin"/>
+      </w:r>
+      <w:r>
+        <w:rPr>
+          <w:color w:val="000000" w:themeColor="text1"/>
+          <w:sz w:val="24"/>
+          <w:szCs w:val="24"/>
+        </w:rPr>
+        <w:instrText xml:space="preserve"> ADDIN ZOTERO_ITEM CSL_CITATION {"citationID":"gB0p3JWK","properties":{"unsorted":false,"formattedCitation":"[5]","plainCitation":"[5]","noteIndex":0},"citationItems":[{"id":493,"uris":["http://zotero.org/users/10576494/items/CSDT4QXZ"],"itemData":{"id":493,"type":"book","ISBN":"978-1-041-08368-9","original-publisher":"Éditions Galileé","publisher":"Routledge Classics","title":"Specters of Marx","author":[{"literal":"Derrida, Jacques"}],"issued":{"date-parts":[["2026"]]},"original-date":{"date-parts":[["1993"]]}}}],"schema":"https://github.com/citation-style-language/schema/raw/master/csl-citation.json"} </w:instrText>
+      </w:r>
+      <w:r>
+        <w:rPr>
+          <w:color w:val="000000" w:themeColor="text1"/>
+          <w:sz w:val="24"/>
+          <w:szCs w:val="24"/>
+        </w:rPr>
+        <w:fldChar w:fldCharType="separate"/>
+      </w:r>
+      <w:r>
+        <w:rPr>
+          <w:noProof/>
+          <w:color w:val="000000" w:themeColor="text1"/>
+          <w:sz w:val="24"/>
+          <w:szCs w:val="24"/>
+        </w:rPr>
+        <w:t>[5]</w:t>
+      </w:r>
+      <w:r>
+        <w:rPr>
+          <w:color w:val="000000" w:themeColor="text1"/>
+          <w:sz w:val="24"/>
+          <w:szCs w:val="24"/>
+        </w:rPr>
+        <w:fldChar w:fldCharType="end"/>
       </w:r>
     </w:p>
     <w:p>
@@ -1898,12 +2462,301 @@
         </w:rPr>
         <w:t>Sketches, storyboards, mock-ups, or test images:</w:t>
       </w:r>
-      <w:r>
-        <w:br/>
-      </w:r>
-    </w:p>
-    <w:p>
-      <w:pPr>
+    </w:p>
+    <w:tbl>
+      <w:tblPr>
+        <w:tblStyle w:val="TableGrid"/>
+        <w:tblW w:w="0" w:type="auto"/>
+        <w:tblBorders>
+          <w:top w:val="none" w:sz="0" w:space="0" w:color="auto"/>
+          <w:left w:val="none" w:sz="0" w:space="0" w:color="auto"/>
+          <w:bottom w:val="none" w:sz="0" w:space="0" w:color="auto"/>
+          <w:right w:val="none" w:sz="0" w:space="0" w:color="auto"/>
+          <w:insideH w:val="none" w:sz="0" w:space="0" w:color="auto"/>
+          <w:insideV w:val="none" w:sz="0" w:space="0" w:color="auto"/>
+        </w:tblBorders>
+        <w:tblLook w:val="04A0" w:firstRow="1" w:lastRow="0" w:firstColumn="1" w:lastColumn="0" w:noHBand="0" w:noVBand="1"/>
+      </w:tblPr>
+      <w:tblGrid>
+        <w:gridCol w:w="9016"/>
+      </w:tblGrid>
+      <w:tr>
+        <w:tc>
+          <w:tcPr>
+            <w:tcW w:w="9016" w:type="dxa"/>
+          </w:tcPr>
+          <w:p>
+            <w:pPr>
+              <w:spacing w:before="240" w:after="240"/>
+              <w:jc w:val="center"/>
+              <w:rPr>
+                <w:rFonts w:ascii="Aptos" w:eastAsia="Aptos" w:hAnsi="Aptos" w:cs="Aptos"/>
+                <w:color w:val="000000" w:themeColor="text1"/>
+              </w:rPr>
+            </w:pPr>
+            <w:r>
+              <w:rPr>
+                <w:rFonts w:ascii="Aptos" w:eastAsia="Aptos" w:hAnsi="Aptos" w:cs="Aptos"/>
+                <w:noProof/>
+                <w:color w:val="000000" w:themeColor="text1"/>
+              </w:rPr>
+              <w:drawing>
+                <wp:inline distT="0" distB="0" distL="0" distR="0" wp14:anchorId="2FD31A87" wp14:editId="1E2F70DB">
+                  <wp:extent cx="4377822" cy="2462463"/>
+                  <wp:effectExtent l="0" t="0" r="3810" b="1905"/>
+                  <wp:docPr id="384676633" name="Picture 4"/>
+                  <wp:cNvGraphicFramePr>
+                    <a:graphicFrameLocks xmlns:a="http://schemas.openxmlformats.org/drawingml/2006/main" noChangeAspect="1"/>
+                  </wp:cNvGraphicFramePr>
+                  <a:graphic xmlns:a="http://schemas.openxmlformats.org/drawingml/2006/main">
+                    <a:graphicData uri="http://schemas.openxmlformats.org/drawingml/2006/picture">
+                      <pic:pic xmlns:pic="http://schemas.openxmlformats.org/drawingml/2006/picture">
+                        <pic:nvPicPr>
+                          <pic:cNvPr id="384676633" name="Picture 384676633"/>
+                          <pic:cNvPicPr/>
+                        </pic:nvPicPr>
+                        <pic:blipFill>
+                          <a:blip r:embed="rId5" cstate="print">
+                            <a:extLst>
+                              <a:ext uri="{28A0092B-C50C-407E-A947-70E740481C1C}">
+                                <a14:useLocalDpi xmlns:a14="http://schemas.microsoft.com/office/drawing/2010/main" val="0"/>
+                              </a:ext>
+                            </a:extLst>
+                          </a:blip>
+                          <a:stretch>
+                            <a:fillRect/>
+                          </a:stretch>
+                        </pic:blipFill>
+                        <pic:spPr>
+                          <a:xfrm>
+                            <a:off x="0" y="0"/>
+                            <a:ext cx="4530375" cy="2548272"/>
+                          </a:xfrm>
+                          <a:prstGeom prst="rect">
+                            <a:avLst/>
+                          </a:prstGeom>
+                        </pic:spPr>
+                      </pic:pic>
+                    </a:graphicData>
+                  </a:graphic>
+                </wp:inline>
+              </w:drawing>
+            </w:r>
+          </w:p>
+        </w:tc>
+      </w:tr>
+      <w:tr>
+        <w:tc>
+          <w:tcPr>
+            <w:tcW w:w="9016" w:type="dxa"/>
+          </w:tcPr>
+          <w:p>
+            <w:pPr>
+              <w:pStyle w:val="Subtitle"/>
+              <w:jc w:val="center"/>
+              <w:rPr>
+                <w:rFonts w:eastAsia="Aptos"/>
+              </w:rPr>
+            </w:pPr>
+            <w:r>
+              <w:rPr>
+                <w:rFonts w:eastAsia="Aptos"/>
+              </w:rPr>
+              <w:t>Provisional layout ideas</w:t>
+            </w:r>
+          </w:p>
+        </w:tc>
+      </w:tr>
+    </w:tbl>
+    <w:p>
+      <w:pPr>
+        <w:spacing w:before="240" w:after="240"/>
+        <w:rPr>
+          <w:rFonts w:ascii="Aptos" w:eastAsia="Aptos" w:hAnsi="Aptos" w:cs="Aptos"/>
+          <w:color w:val="000000" w:themeColor="text1"/>
+        </w:rPr>
+      </w:pPr>
+    </w:p>
+    <w:tbl>
+      <w:tblPr>
+        <w:tblStyle w:val="TableGrid"/>
+        <w:tblW w:w="0" w:type="auto"/>
+        <w:tblBorders>
+          <w:top w:val="none" w:sz="0" w:space="0" w:color="auto"/>
+          <w:left w:val="none" w:sz="0" w:space="0" w:color="auto"/>
+          <w:bottom w:val="none" w:sz="0" w:space="0" w:color="auto"/>
+          <w:right w:val="none" w:sz="0" w:space="0" w:color="auto"/>
+          <w:insideH w:val="none" w:sz="0" w:space="0" w:color="auto"/>
+          <w:insideV w:val="none" w:sz="0" w:space="0" w:color="auto"/>
+        </w:tblBorders>
+        <w:tblLook w:val="04A0" w:firstRow="1" w:lastRow="0" w:firstColumn="1" w:lastColumn="0" w:noHBand="0" w:noVBand="1"/>
+      </w:tblPr>
+      <w:tblGrid>
+        <w:gridCol w:w="4314"/>
+        <w:gridCol w:w="4345"/>
+      </w:tblGrid>
+      <w:tr>
+        <w:trPr>
+          <w:trHeight w:val="5590"/>
+        </w:trPr>
+        <w:tc>
+          <w:tcPr>
+            <w:tcW w:w="4314" w:type="dxa"/>
+          </w:tcPr>
+          <w:p>
+            <w:pPr>
+              <w:spacing w:before="240" w:after="240"/>
+              <w:jc w:val="center"/>
+            </w:pPr>
+            <w:r>
+              <w:rPr>
+                <w:noProof/>
+              </w:rPr>
+              <w:drawing>
+                <wp:inline distT="0" distB="0" distL="0" distR="0" wp14:anchorId="152FE2A0" wp14:editId="0AC40CE5">
+                  <wp:extent cx="2438400" cy="4335137"/>
+                  <wp:effectExtent l="0" t="0" r="0" b="0"/>
+                  <wp:docPr id="1646114056" name="Picture 2"/>
+                  <wp:cNvGraphicFramePr>
+                    <a:graphicFrameLocks xmlns:a="http://schemas.openxmlformats.org/drawingml/2006/main" noChangeAspect="1"/>
+                  </wp:cNvGraphicFramePr>
+                  <a:graphic xmlns:a="http://schemas.openxmlformats.org/drawingml/2006/main">
+                    <a:graphicData uri="http://schemas.openxmlformats.org/drawingml/2006/picture">
+                      <pic:pic xmlns:pic="http://schemas.openxmlformats.org/drawingml/2006/picture">
+                        <pic:nvPicPr>
+                          <pic:cNvPr id="1646114056" name="Picture 1646114056"/>
+                          <pic:cNvPicPr/>
+                        </pic:nvPicPr>
+                        <pic:blipFill>
+                          <a:blip r:embed="rId6" cstate="print">
+                            <a:extLst>
+                              <a:ext uri="{28A0092B-C50C-407E-A947-70E740481C1C}">
+                                <a14:useLocalDpi xmlns:a14="http://schemas.microsoft.com/office/drawing/2010/main" val="0"/>
+                              </a:ext>
+                            </a:extLst>
+                          </a:blip>
+                          <a:stretch>
+                            <a:fillRect/>
+                          </a:stretch>
+                        </pic:blipFill>
+                        <pic:spPr>
+                          <a:xfrm>
+                            <a:off x="0" y="0"/>
+                            <a:ext cx="2741383" cy="4873799"/>
+                          </a:xfrm>
+                          <a:prstGeom prst="rect">
+                            <a:avLst/>
+                          </a:prstGeom>
+                        </pic:spPr>
+                      </pic:pic>
+                    </a:graphicData>
+                  </a:graphic>
+                </wp:inline>
+              </w:drawing>
+            </w:r>
+          </w:p>
+          <w:p>
+            <w:pPr>
+              <w:spacing w:before="240" w:after="240"/>
+              <w:jc w:val="center"/>
+            </w:pPr>
+          </w:p>
+        </w:tc>
+        <w:tc>
+          <w:tcPr>
+            <w:tcW w:w="4345" w:type="dxa"/>
+          </w:tcPr>
+          <w:p>
+            <w:pPr>
+              <w:spacing w:before="240" w:after="240"/>
+              <w:jc w:val="center"/>
+            </w:pPr>
+            <w:r>
+              <w:rPr>
+                <w:noProof/>
+              </w:rPr>
+              <w:drawing>
+                <wp:inline distT="0" distB="0" distL="0" distR="0" wp14:anchorId="2132FEC5" wp14:editId="4B11F3D5">
+                  <wp:extent cx="2438045" cy="4334510"/>
+                  <wp:effectExtent l="0" t="0" r="635" b="0"/>
+                  <wp:docPr id="191939200" name="Picture 3"/>
+                  <wp:cNvGraphicFramePr>
+                    <a:graphicFrameLocks xmlns:a="http://schemas.openxmlformats.org/drawingml/2006/main" noChangeAspect="1"/>
+                  </wp:cNvGraphicFramePr>
+                  <a:graphic xmlns:a="http://schemas.openxmlformats.org/drawingml/2006/main">
+                    <a:graphicData uri="http://schemas.openxmlformats.org/drawingml/2006/picture">
+                      <pic:pic xmlns:pic="http://schemas.openxmlformats.org/drawingml/2006/picture">
+                        <pic:nvPicPr>
+                          <pic:cNvPr id="191939200" name="Picture 191939200"/>
+                          <pic:cNvPicPr/>
+                        </pic:nvPicPr>
+                        <pic:blipFill>
+                          <a:blip r:embed="rId7" cstate="print">
+                            <a:extLst>
+                              <a:ext uri="{28A0092B-C50C-407E-A947-70E740481C1C}">
+                                <a14:useLocalDpi xmlns:a14="http://schemas.microsoft.com/office/drawing/2010/main" val="0"/>
+                              </a:ext>
+                            </a:extLst>
+                          </a:blip>
+                          <a:stretch>
+                            <a:fillRect/>
+                          </a:stretch>
+                        </pic:blipFill>
+                        <pic:spPr>
+                          <a:xfrm>
+                            <a:off x="0" y="0"/>
+                            <a:ext cx="2511819" cy="4465671"/>
+                          </a:xfrm>
+                          <a:prstGeom prst="rect">
+                            <a:avLst/>
+                          </a:prstGeom>
+                        </pic:spPr>
+                      </pic:pic>
+                    </a:graphicData>
+                  </a:graphic>
+                </wp:inline>
+              </w:drawing>
+            </w:r>
+          </w:p>
+        </w:tc>
+      </w:tr>
+      <w:tr>
+        <w:trPr>
+          <w:trHeight w:val="788"/>
+        </w:trPr>
+        <w:tc>
+          <w:tcPr>
+            <w:tcW w:w="4314" w:type="dxa"/>
+          </w:tcPr>
+          <w:p>
+            <w:pPr>
+              <w:pStyle w:val="Subtitle"/>
+              <w:jc w:val="center"/>
+            </w:pPr>
+            <w:r>
+              <w:t>Physical item &amp; hung map</w:t>
+            </w:r>
+          </w:p>
+        </w:tc>
+        <w:tc>
+          <w:tcPr>
+            <w:tcW w:w="4345" w:type="dxa"/>
+          </w:tcPr>
+          <w:p>
+            <w:pPr>
+              <w:pStyle w:val="Subtitle"/>
+              <w:jc w:val="center"/>
+            </w:pPr>
+            <w:r>
+              <w:t>Provisional idea for top-down view of exhibition</w:t>
+            </w:r>
+          </w:p>
+        </w:tc>
+      </w:tr>
+    </w:tbl>
+    <w:p>
+      <w:pPr>
+        <w:spacing w:before="240" w:after="240"/>
         <w:rPr>
           <w:rFonts w:ascii="Aptos" w:eastAsia="Aptos" w:hAnsi="Aptos" w:cs="Aptos"/>
           <w:color w:val="000000" w:themeColor="text1"/>
@@ -1922,7 +2775,7 @@
       <w:pPr>
         <w:pStyle w:val="Bibliography"/>
         <w:rPr>
-          <w:rFonts w:ascii="Aptos" w:cs="Times New Roman"/>
+          <w:rFonts w:ascii="Times New Roman" w:hAnsi="Times New Roman" w:cs="Times New Roman"/>
         </w:rPr>
       </w:pPr>
       <w:r>
@@ -1936,13 +2789,13 @@
       </w:r>
       <w:r>
         <w:rPr>
-          <w:rFonts w:ascii="Aptos" w:cs="Times New Roman"/>
+          <w:rFonts w:ascii="Times New Roman" w:hAnsi="Times New Roman" w:cs="Times New Roman"/>
         </w:rPr>
         <w:t>[1]</w:t>
       </w:r>
       <w:r>
         <w:rPr>
-          <w:rFonts w:ascii="Aptos" w:cs="Times New Roman"/>
+          <w:rFonts w:ascii="Times New Roman" w:hAnsi="Times New Roman" w:cs="Times New Roman"/>
         </w:rPr>
         <w:tab/>
         <w:t xml:space="preserve">S. </w:t>
@@ -1950,20 +2803,20 @@
       <w:proofErr w:type="spellStart"/>
       <w:r>
         <w:rPr>
-          <w:rFonts w:ascii="Aptos" w:cs="Times New Roman"/>
+          <w:rFonts w:ascii="Times New Roman" w:hAnsi="Times New Roman" w:cs="Times New Roman"/>
         </w:rPr>
         <w:t>Boym</w:t>
       </w:r>
       <w:proofErr w:type="spellEnd"/>
       <w:r>
         <w:rPr>
-          <w:rFonts w:ascii="Aptos" w:cs="Times New Roman"/>
+          <w:rFonts w:ascii="Times New Roman" w:hAnsi="Times New Roman" w:cs="Times New Roman"/>
         </w:rPr>
         <w:t xml:space="preserve">, </w:t>
       </w:r>
       <w:r>
         <w:rPr>
-          <w:rFonts w:ascii="Aptos" w:cs="Times New Roman"/>
+          <w:rFonts w:ascii="Times New Roman" w:hAnsi="Times New Roman" w:cs="Times New Roman"/>
           <w:i/>
           <w:iCs/>
         </w:rPr>
@@ -1971,7 +2824,7 @@
       </w:r>
       <w:r>
         <w:rPr>
-          <w:rFonts w:ascii="Aptos" w:cs="Times New Roman"/>
+          <w:rFonts w:ascii="Times New Roman" w:hAnsi="Times New Roman" w:cs="Times New Roman"/>
         </w:rPr>
         <w:t>. New York: Basic Books, 2001.</w:t>
       </w:r>
@@ -1980,18 +2833,134 @@
       <w:pPr>
         <w:pStyle w:val="Bibliography"/>
         <w:rPr>
-          <w:rFonts w:ascii="Aptos" w:cs="Times New Roman"/>
-        </w:rPr>
-      </w:pPr>
-      <w:r>
-        <w:rPr>
-          <w:rFonts w:ascii="Aptos" w:cs="Times New Roman"/>
+          <w:rFonts w:ascii="Times New Roman" w:hAnsi="Times New Roman" w:cs="Times New Roman"/>
+        </w:rPr>
+      </w:pPr>
+      <w:r>
+        <w:rPr>
+          <w:rFonts w:ascii="Times New Roman" w:hAnsi="Times New Roman" w:cs="Times New Roman"/>
         </w:rPr>
         <w:t>[2]</w:t>
       </w:r>
       <w:r>
         <w:rPr>
-          <w:rFonts w:ascii="Aptos" w:cs="Times New Roman"/>
+          <w:rFonts w:ascii="Times New Roman" w:hAnsi="Times New Roman" w:cs="Times New Roman"/>
+        </w:rPr>
+        <w:tab/>
+        <w:t xml:space="preserve">M. Fisher, </w:t>
+      </w:r>
+      <w:r>
+        <w:rPr>
+          <w:rFonts w:ascii="Times New Roman" w:hAnsi="Times New Roman" w:cs="Times New Roman"/>
+          <w:i/>
+          <w:iCs/>
+        </w:rPr>
+        <w:t>Capitalist realism is there no alternative?</w:t>
+      </w:r>
+      <w:r>
+        <w:rPr>
+          <w:rFonts w:ascii="Times New Roman" w:hAnsi="Times New Roman" w:cs="Times New Roman"/>
+        </w:rPr>
+        <w:t xml:space="preserve"> Winchester, UK: Zero Books, 2009.</w:t>
+      </w:r>
+    </w:p>
+    <w:p>
+      <w:pPr>
+        <w:pStyle w:val="Bibliography"/>
+        <w:rPr>
+          <w:rFonts w:ascii="Times New Roman" w:hAnsi="Times New Roman" w:cs="Times New Roman"/>
+        </w:rPr>
+      </w:pPr>
+      <w:r>
+        <w:rPr>
+          <w:rFonts w:ascii="Times New Roman" w:hAnsi="Times New Roman" w:cs="Times New Roman"/>
+        </w:rPr>
+        <w:t>[3]</w:t>
+      </w:r>
+      <w:r>
+        <w:rPr>
+          <w:rFonts w:ascii="Times New Roman" w:hAnsi="Times New Roman" w:cs="Times New Roman"/>
+        </w:rPr>
+        <w:tab/>
+        <w:t xml:space="preserve">M. Fisher, </w:t>
+      </w:r>
+      <w:r>
+        <w:rPr>
+          <w:rFonts w:ascii="Times New Roman" w:hAnsi="Times New Roman" w:cs="Times New Roman"/>
+          <w:i/>
+          <w:iCs/>
+        </w:rPr>
+        <w:t xml:space="preserve">Ghosts of my </w:t>
+      </w:r>
+      <w:proofErr w:type="gramStart"/>
+      <w:r>
+        <w:rPr>
+          <w:rFonts w:ascii="Times New Roman" w:hAnsi="Times New Roman" w:cs="Times New Roman"/>
+          <w:i/>
+          <w:iCs/>
+        </w:rPr>
+        <w:t>life :</w:t>
+      </w:r>
+      <w:proofErr w:type="gramEnd"/>
+      <w:r>
+        <w:rPr>
+          <w:rFonts w:ascii="Times New Roman" w:hAnsi="Times New Roman" w:cs="Times New Roman"/>
+          <w:i/>
+          <w:iCs/>
+        </w:rPr>
+        <w:t xml:space="preserve"> writings on depression, hauntology and lost futures</w:t>
+      </w:r>
+      <w:r>
+        <w:rPr>
+          <w:rFonts w:ascii="Times New Roman" w:hAnsi="Times New Roman" w:cs="Times New Roman"/>
+        </w:rPr>
+        <w:t xml:space="preserve">, </w:t>
+      </w:r>
+      <w:proofErr w:type="gramStart"/>
+      <w:r>
+        <w:rPr>
+          <w:rFonts w:ascii="Times New Roman" w:hAnsi="Times New Roman" w:cs="Times New Roman"/>
+        </w:rPr>
+        <w:t>New</w:t>
+      </w:r>
+      <w:proofErr w:type="gramEnd"/>
+      <w:r>
+        <w:rPr>
+          <w:rFonts w:ascii="Times New Roman" w:hAnsi="Times New Roman" w:cs="Times New Roman"/>
+        </w:rPr>
+        <w:t xml:space="preserve"> edition / with introduction by Matt Colquhoun and Afterword by Simon </w:t>
+      </w:r>
+      <w:proofErr w:type="gramStart"/>
+      <w:r>
+        <w:rPr>
+          <w:rFonts w:ascii="Times New Roman" w:hAnsi="Times New Roman" w:cs="Times New Roman"/>
+        </w:rPr>
+        <w:t>Reynolds..</w:t>
+      </w:r>
+      <w:proofErr w:type="gramEnd"/>
+      <w:r>
+        <w:rPr>
+          <w:rFonts w:ascii="Times New Roman" w:hAnsi="Times New Roman" w:cs="Times New Roman"/>
+        </w:rPr>
+        <w:t xml:space="preserve"> Winchester, UK: Zero Books, 2014.</w:t>
+      </w:r>
+    </w:p>
+    <w:p>
+      <w:pPr>
+        <w:pStyle w:val="Bibliography"/>
+        <w:rPr>
+          <w:rFonts w:ascii="Times New Roman" w:hAnsi="Times New Roman" w:cs="Times New Roman"/>
+        </w:rPr>
+      </w:pPr>
+      <w:r>
+        <w:rPr>
+          <w:rFonts w:ascii="Times New Roman" w:hAnsi="Times New Roman" w:cs="Times New Roman"/>
+        </w:rPr>
+        <w:t>[4]</w:t>
+      </w:r>
+      <w:r>
+        <w:rPr>
+          <w:rFonts w:ascii="Times New Roman" w:hAnsi="Times New Roman" w:cs="Times New Roman"/>
         </w:rPr>
         <w:tab/>
         <w:t>‘Stepping into the Dark, by Chris Watson’, Chris Watson. Accessed: May 22, 2026. [Online]. Available: https://chriswatsonreleases.bandcamp.com/album/stepping-into-the-dark</w:t>
@@ -2000,6 +2969,42 @@
     <w:p>
       <w:pPr>
         <w:pStyle w:val="Bibliography"/>
+        <w:rPr>
+          <w:rFonts w:ascii="Times New Roman" w:hAnsi="Times New Roman" w:cs="Times New Roman"/>
+        </w:rPr>
+      </w:pPr>
+      <w:r>
+        <w:rPr>
+          <w:rFonts w:ascii="Times New Roman" w:hAnsi="Times New Roman" w:cs="Times New Roman"/>
+        </w:rPr>
+        <w:t>[5]</w:t>
+      </w:r>
+      <w:r>
+        <w:rPr>
+          <w:rFonts w:ascii="Times New Roman" w:hAnsi="Times New Roman" w:cs="Times New Roman"/>
+        </w:rPr>
+        <w:tab/>
+        <w:t xml:space="preserve">Derrida, Jacques, </w:t>
+      </w:r>
+      <w:r>
+        <w:rPr>
+          <w:rFonts w:ascii="Times New Roman" w:hAnsi="Times New Roman" w:cs="Times New Roman"/>
+          <w:i/>
+          <w:iCs/>
+        </w:rPr>
+        <w:t>Specters of Marx</w:t>
+      </w:r>
+      <w:r>
+        <w:rPr>
+          <w:rFonts w:ascii="Times New Roman" w:hAnsi="Times New Roman" w:cs="Times New Roman"/>
+        </w:rPr>
+        <w:t>. Routledge Classics, 2026.</w:t>
+      </w:r>
+    </w:p>
+    <w:p>
+      <w:pPr>
+        <w:pStyle w:val="Bibliography"/>
+        <w:ind w:left="0" w:firstLine="0"/>
       </w:pPr>
       <w:r>
         <w:fldChar w:fldCharType="end"/>
@@ -3342,6 +4347,7 @@
   <w:style w:type="paragraph" w:default="1" w:styleId="Normal">
     <w:name w:val="Normal"/>
     <w:qFormat/>
+    <w:rsid w:val="0015078A"/>
   </w:style>
   <w:style w:type="paragraph" w:styleId="Heading2">
     <w:name w:val="heading 2"/>
@@ -3456,6 +4462,39 @@
       <w:spacing w:after="0" w:line="240" w:lineRule="auto"/>
       <w:ind w:left="384" w:hanging="384"/>
     </w:pPr>
+  </w:style>
+  <w:style w:type="paragraph" w:styleId="Subtitle">
+    <w:name w:val="Subtitle"/>
+    <w:basedOn w:val="Normal"/>
+    <w:next w:val="Normal"/>
+    <w:link w:val="SubtitleChar"/>
+    <w:uiPriority w:val="11"/>
+    <w:qFormat/>
+    <w:rsid w:val="000F24F4"/>
+    <w:pPr>
+      <w:numPr>
+        <w:ilvl w:val="1"/>
+      </w:numPr>
+    </w:pPr>
+    <w:rPr>
+      <w:color w:val="5A5A5A" w:themeColor="text1" w:themeTint="A5"/>
+      <w:spacing w:val="15"/>
+      <w:sz w:val="22"/>
+      <w:szCs w:val="22"/>
+    </w:rPr>
+  </w:style>
+  <w:style w:type="character" w:customStyle="1" w:styleId="SubtitleChar">
+    <w:name w:val="Subtitle Char"/>
+    <w:basedOn w:val="DefaultParagraphFont"/>
+    <w:link w:val="Subtitle"/>
+    <w:uiPriority w:val="11"/>
+    <w:rsid w:val="000F24F4"/>
+    <w:rPr>
+      <w:color w:val="5A5A5A" w:themeColor="text1" w:themeTint="A5"/>
+      <w:spacing w:val="15"/>
+      <w:sz w:val="22"/>
+      <w:szCs w:val="22"/>
+    </w:rPr>
   </w:style>
 </w:styles>
 </file>

</xml_diff>